<commit_message>
vault backup: 2025-09-03 02:00:02
</commit_message>
<xml_diff>
--- a/! My Stuff/Ashwin Suresh - Resume _ word.docx
+++ b/! My Stuff/Ashwin Suresh - Resume _ word.docx
@@ -166,7 +166,7 @@
           </mc:Choice>
           <mc:Fallback>
             <w:pict>
-              <v:shape w14:anchorId="3946A5E3" id="Graphic 2" o:spid="_x0000_s1026" style="position:absolute;margin-left:34.55pt;margin-top:15.6pt;width:526.3pt;height:2.2pt;z-index:-15728640;visibility:visible;mso-wrap-style:square;mso-wrap-distance-left:0;mso-wrap-distance-top:0;mso-wrap-distance-right:0;mso-wrap-distance-bottom:0;mso-position-horizontal:absolute;mso-position-horizontal-relative:page;mso-position-vertical:absolute;mso-position-vertical-relative:text;v-text-anchor:top" coordsize="6684009,27940" o:gfxdata="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" path="m6684009,l,,,27431r6684009,l6684009,xe" fillcolor="black" stroked="f">
+              <v:shape w14:anchorId="71AA26EA" id="Graphic 2" o:spid="_x0000_s1026" style="position:absolute;margin-left:34.55pt;margin-top:15.6pt;width:526.3pt;height:2.2pt;z-index:-15728640;visibility:visible;mso-wrap-style:square;mso-wrap-distance-left:0;mso-wrap-distance-top:0;mso-wrap-distance-right:0;mso-wrap-distance-bottom:0;mso-position-horizontal:absolute;mso-position-horizontal-relative:page;mso-position-vertical:absolute;mso-position-vertical-relative:text;v-text-anchor:top" coordsize="6684009,27940" o:gfxdata="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" path="m6684009,l,,,27431r6684009,l6684009,xe" fillcolor="black" stroked="f">
                 <v:path arrowok="t"/>
                 <w10:wrap type="topAndBottom" anchorx="page"/>
               </v:shape>
@@ -337,7 +337,7 @@
           </mc:Choice>
           <mc:Fallback>
             <w:pict>
-              <v:group w14:anchorId="68A071C0" id="Group 3" o:spid="_x0000_s1026" style="width:526.3pt;height:.75pt;mso-position-horizontal-relative:char;mso-position-vertical-relative:line" coordsize="66840,95" o:gfxdata="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">
+              <v:group w14:anchorId="65AF8EB5" id="Group 3" o:spid="_x0000_s1026" style="width:526.3pt;height:.75pt;mso-position-horizontal-relative:char;mso-position-vertical-relative:line" coordsize="66840,95" o:gfxdata="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">
                 <v:shape id="Graphic 4" o:spid="_x0000_s1027" style="position:absolute;width:66840;height:95;visibility:visible;mso-wrap-style:square;v-text-anchor:top" coordsize="6684009,9525" o:gfxdata="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" path="m6684009,l,,,9144r6684009,l6684009,xe" fillcolor="black" stroked="f">
                   <v:path arrowok="t"/>
                 </v:shape>
@@ -453,14 +453,18 @@
         </w:rPr>
         <w:t xml:space="preserve"> </w:t>
       </w:r>
-      <w:proofErr w:type="spellStart"/>
       <w:r>
         <w:rPr>
           <w:sz w:val="18"/>
         </w:rPr>
         <w:t>Supabase</w:t>
       </w:r>
-      <w:proofErr w:type="spellEnd"/>
+      <w:r>
+        <w:rPr>
+          <w:sz w:val="18"/>
+        </w:rPr>
+        <w:t>, FastAPI</w:t>
+      </w:r>
     </w:p>
     <w:p>
       <w:pPr>
@@ -838,7 +842,7 @@
           </mc:Choice>
           <mc:Fallback>
             <w:pict>
-              <v:shape w14:anchorId="4BDA081A" id="Graphic 5" o:spid="_x0000_s1026" style="position:absolute;margin-left:34.55pt;margin-top:16.8pt;width:526.3pt;height:.75pt;z-index:15731712;visibility:visible;mso-wrap-style:square;mso-wrap-distance-left:0;mso-wrap-distance-top:0;mso-wrap-distance-right:0;mso-wrap-distance-bottom:0;mso-position-horizontal:absolute;mso-position-horizontal-relative:page;mso-position-vertical:absolute;mso-position-vertical-relative:text;v-text-anchor:top" coordsize="6684009,9525" o:gfxdata="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" path="m6684009,l,,,9144r6684009,l6684009,xe" fillcolor="black" stroked="f">
+              <v:shape w14:anchorId="46AFF173" id="Graphic 5" o:spid="_x0000_s1026" style="position:absolute;margin-left:34.55pt;margin-top:16.8pt;width:526.3pt;height:.75pt;z-index:15731712;visibility:visible;mso-wrap-style:square;mso-wrap-distance-left:0;mso-wrap-distance-top:0;mso-wrap-distance-right:0;mso-wrap-distance-bottom:0;mso-position-horizontal:absolute;mso-position-horizontal-relative:page;mso-position-vertical:absolute;mso-position-vertical-relative:text;v-text-anchor:top" coordsize="6684009,9525" o:gfxdata="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" path="m6684009,l,,,9144r6684009,l6684009,xe" fillcolor="black" stroked="f">
                 <v:path arrowok="t"/>
                 <w10:wrap anchorx="page"/>
               </v:shape>
@@ -940,13 +944,9 @@
         </w:rPr>
         <w:t xml:space="preserve"> </w:t>
       </w:r>
-      <w:proofErr w:type="spellStart"/>
-      <w:proofErr w:type="gramStart"/>
       <w:r>
         <w:t>B.Tech</w:t>
       </w:r>
-      <w:proofErr w:type="spellEnd"/>
-      <w:proofErr w:type="gramEnd"/>
       <w:r>
         <w:rPr>
           <w:spacing w:val="-2"/>
@@ -1062,14 +1062,12 @@
         </w:rPr>
         <w:t xml:space="preserve"> </w:t>
       </w:r>
-      <w:proofErr w:type="spellStart"/>
       <w:r>
         <w:rPr>
           <w:spacing w:val="-2"/>
         </w:rPr>
         <w:t>Mannanam</w:t>
       </w:r>
-      <w:proofErr w:type="spellEnd"/>
       <w:r>
         <w:tab/>
       </w:r>
@@ -1347,7 +1345,7 @@
           </mc:Choice>
           <mc:Fallback>
             <w:pict>
-              <v:shape w14:anchorId="5B2B2CB2" id="Graphic 6" o:spid="_x0000_s1026" style="position:absolute;margin-left:34.55pt;margin-top:17.5pt;width:526.3pt;height:.75pt;z-index:-15727616;visibility:visible;mso-wrap-style:square;mso-wrap-distance-left:0;mso-wrap-distance-top:0;mso-wrap-distance-right:0;mso-wrap-distance-bottom:0;mso-position-horizontal:absolute;mso-position-horizontal-relative:page;mso-position-vertical:absolute;mso-position-vertical-relative:text;v-text-anchor:top" coordsize="6684009,9525" o:gfxdata="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" path="m6684009,l,,,9144r6684009,l6684009,xe" fillcolor="black" stroked="f">
+              <v:shape w14:anchorId="46E2EF85" id="Graphic 6" o:spid="_x0000_s1026" style="position:absolute;margin-left:34.55pt;margin-top:17.5pt;width:526.3pt;height:.75pt;z-index:-15727616;visibility:visible;mso-wrap-style:square;mso-wrap-distance-left:0;mso-wrap-distance-top:0;mso-wrap-distance-right:0;mso-wrap-distance-bottom:0;mso-position-horizontal:absolute;mso-position-horizontal-relative:page;mso-position-vertical:absolute;mso-position-vertical-relative:text;v-text-anchor:top" coordsize="6684009,9525" o:gfxdata="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" path="m6684009,l,,,9144r6684009,l6684009,xe" fillcolor="black" stroked="f">
                 <v:path arrowok="t"/>
                 <w10:wrap type="topAndBottom" anchorx="page"/>
               </v:shape>
@@ -1381,7 +1379,6 @@
           <w:sz w:val="18"/>
         </w:rPr>
       </w:pPr>
-      <w:proofErr w:type="spellStart"/>
       <w:r>
         <w:rPr>
           <w:b/>
@@ -1390,7 +1387,6 @@
         </w:rPr>
         <w:t>ChapterHouse</w:t>
       </w:r>
-      <w:proofErr w:type="spellEnd"/>
       <w:r>
         <w:rPr>
           <w:b/>
@@ -1558,7 +1554,6 @@
         </w:rPr>
         <w:t xml:space="preserve"> </w:t>
       </w:r>
-      <w:proofErr w:type="spellStart"/>
       <w:r>
         <w:rPr>
           <w:i/>
@@ -1567,7 +1562,6 @@
         </w:rPr>
         <w:t>FastAPI</w:t>
       </w:r>
-      <w:proofErr w:type="spellEnd"/>
     </w:p>
     <w:p>
       <w:pPr>
@@ -1584,13 +1578,8 @@
         </w:rPr>
         <w:t xml:space="preserve"> </w:t>
       </w:r>
-      <w:proofErr w:type="spellStart"/>
-      <w:r>
-        <w:t>ChapterHouse</w:t>
-      </w:r>
-      <w:proofErr w:type="spellEnd"/>
-      <w:r>
-        <w:t>,</w:t>
+      <w:r>
+        <w:t>ChapterHouse,</w:t>
       </w:r>
       <w:r>
         <w:rPr>
@@ -1681,7 +1670,6 @@
           <w:sz w:val="18"/>
         </w:rPr>
       </w:pPr>
-      <w:proofErr w:type="spellStart"/>
       <w:r>
         <w:rPr>
           <w:b/>
@@ -1690,7 +1678,6 @@
         </w:rPr>
         <w:t>PyPlayer</w:t>
       </w:r>
-      <w:proofErr w:type="spellEnd"/>
       <w:r>
         <w:rPr>
           <w:b/>
@@ -1903,13 +1890,8 @@
         </w:rPr>
         <w:t xml:space="preserve"> </w:t>
       </w:r>
-      <w:proofErr w:type="spellStart"/>
-      <w:r>
-        <w:t>PyPlayer</w:t>
-      </w:r>
-      <w:proofErr w:type="spellEnd"/>
-      <w:r>
-        <w:t>,</w:t>
+      <w:r>
+        <w:t>PyPlayer,</w:t>
       </w:r>
       <w:r>
         <w:rPr>
@@ -2072,7 +2054,6 @@
           <w:sz w:val="18"/>
         </w:rPr>
       </w:pPr>
-      <w:proofErr w:type="spellStart"/>
       <w:r>
         <w:rPr>
           <w:b/>
@@ -2081,7 +2062,6 @@
         </w:rPr>
         <w:t>EcoSnap</w:t>
       </w:r>
-      <w:proofErr w:type="spellEnd"/>
       <w:r>
         <w:rPr>
           <w:b/>
@@ -2259,23 +2239,7 @@
           <w:i/>
           <w:sz w:val="18"/>
         </w:rPr>
-        <w:t xml:space="preserve"> </w:t>
-      </w:r>
-      <w:proofErr w:type="spellStart"/>
-      <w:r>
-        <w:rPr>
-          <w:i/>
-          <w:sz w:val="18"/>
-        </w:rPr>
-        <w:t>Supabase</w:t>
-      </w:r>
-      <w:proofErr w:type="spellEnd"/>
-      <w:r>
-        <w:rPr>
-          <w:i/>
-          <w:sz w:val="18"/>
-        </w:rPr>
-        <w:t>,</w:t>
+        <w:t xml:space="preserve"> Supabase,</w:t>
       </w:r>
       <w:r>
         <w:rPr>
@@ -2366,11 +2330,9 @@
         </w:rPr>
         <w:t xml:space="preserve"> </w:t>
       </w:r>
-      <w:proofErr w:type="spellStart"/>
       <w:r>
         <w:t>EcoSnap</w:t>
       </w:r>
-      <w:proofErr w:type="spellEnd"/>
       <w:r>
         <w:t>,</w:t>
       </w:r>
@@ -2515,7 +2477,7 @@
           </mc:Choice>
           <mc:Fallback>
             <w:pict>
-              <v:shape w14:anchorId="4A307219" id="Graphic 8" o:spid="_x0000_s1026" style="position:absolute;margin-left:34.55pt;margin-top:-4.75pt;width:526.3pt;height:.75pt;z-index:15732224;visibility:visible;mso-wrap-style:square;mso-wrap-distance-left:0;mso-wrap-distance-top:0;mso-wrap-distance-right:0;mso-wrap-distance-bottom:0;mso-position-horizontal:absolute;mso-position-horizontal-relative:page;mso-position-vertical:absolute;mso-position-vertical-relative:text;v-text-anchor:top" coordsize="6684009,9525" o:gfxdata="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" path="m6684009,l,,,9144r6684009,l6684009,xe" fillcolor="black" stroked="f">
+              <v:shape w14:anchorId="2400736E" id="Graphic 8" o:spid="_x0000_s1026" style="position:absolute;margin-left:34.55pt;margin-top:-4.75pt;width:526.3pt;height:.75pt;z-index:15732224;visibility:visible;mso-wrap-style:square;mso-wrap-distance-left:0;mso-wrap-distance-top:0;mso-wrap-distance-right:0;mso-wrap-distance-bottom:0;mso-position-horizontal:absolute;mso-position-horizontal-relative:page;mso-position-vertical:absolute;mso-position-vertical-relative:text;v-text-anchor:top" coordsize="6684009,9525" o:gfxdata="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" path="m6684009,l,,,9144r6684009,l6684009,xe" fillcolor="black" stroked="f">
                 <v:path arrowok="t"/>
                 <w10:wrap anchorx="page"/>
               </v:shape>
@@ -3104,7 +3066,7 @@
           </mc:Choice>
           <mc:Fallback>
             <w:pict>
-              <v:shape w14:anchorId="1DC2C57D" id="Graphic 9" o:spid="_x0000_s1026" style="position:absolute;margin-left:34.55pt;margin-top:17.75pt;width:526.3pt;height:.75pt;z-index:-15726592;visibility:visible;mso-wrap-style:square;mso-wrap-distance-left:0;mso-wrap-distance-top:0;mso-wrap-distance-right:0;mso-wrap-distance-bottom:0;mso-position-horizontal:absolute;mso-position-horizontal-relative:page;mso-position-vertical:absolute;mso-position-vertical-relative:text;v-text-anchor:top" coordsize="6684009,9525" o:gfxdata="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" path="m6684009,l,,,9144r6684009,l6684009,xe" fillcolor="black" stroked="f">
+              <v:shape w14:anchorId="39939CD3" id="Graphic 9" o:spid="_x0000_s1026" style="position:absolute;margin-left:34.55pt;margin-top:17.75pt;width:526.3pt;height:.75pt;z-index:-15726592;visibility:visible;mso-wrap-style:square;mso-wrap-distance-left:0;mso-wrap-distance-top:0;mso-wrap-distance-right:0;mso-wrap-distance-bottom:0;mso-position-horizontal:absolute;mso-position-horizontal-relative:page;mso-position-vertical:absolute;mso-position-vertical-relative:text;v-text-anchor:top" coordsize="6684009,9525" o:gfxdata="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" path="m6684009,l,,,9144r6684009,l6684009,xe" fillcolor="black" stroked="f">
                 <v:path arrowok="t"/>
                 <w10:wrap type="topAndBottom" anchorx="page"/>
               </v:shape>
@@ -3198,19 +3160,8 @@
             <w:sz w:val="18"/>
             <w:szCs w:val="18"/>
           </w:rPr>
-          <w:t xml:space="preserve">Hack for Impact – IEEE </w:t>
+          <w:t>Hack for Impact – IEEE Hackaton</w:t>
         </w:r>
-        <w:proofErr w:type="spellStart"/>
-        <w:r>
-          <w:rPr>
-            <w:b/>
-            <w:bCs/>
-            <w:sz w:val="18"/>
-            <w:szCs w:val="18"/>
-          </w:rPr>
-          <w:t>Hackaton</w:t>
-        </w:r>
-        <w:proofErr w:type="spellEnd"/>
       </w:hyperlink>
       <w:r>
         <w:rPr>
@@ -3225,17 +3176,8 @@
           <w:color w:val="000000" w:themeColor="text1"/>
           <w:sz w:val="18"/>
         </w:rPr>
-        <w:t xml:space="preserve"> a </w:t>
-      </w:r>
-      <w:proofErr w:type="spellStart"/>
-      <w:r>
-        <w:rPr>
-          <w:color w:val="000000" w:themeColor="text1"/>
-          <w:sz w:val="18"/>
-        </w:rPr>
-        <w:t>hackaton</w:t>
-      </w:r>
-      <w:proofErr w:type="spellEnd"/>
+        <w:t xml:space="preserve"> a hackaton</w:t>
+      </w:r>
       <w:r>
         <w:rPr>
           <w:color w:val="000000" w:themeColor="text1"/>
@@ -4379,17 +4321,8 @@
           <w:b/>
           <w:sz w:val="18"/>
         </w:rPr>
-        <w:t xml:space="preserve">D-Zone </w:t>
-      </w:r>
-      <w:proofErr w:type="spellStart"/>
-      <w:r>
-        <w:rPr>
-          <w:b/>
-          <w:sz w:val="18"/>
-        </w:rPr>
-        <w:t>Mens</w:t>
-      </w:r>
-      <w:proofErr w:type="spellEnd"/>
+        <w:t>D-Zone Mens</w:t>
+      </w:r>
       <w:r>
         <w:rPr>
           <w:b/>
@@ -4539,14 +4472,12 @@
         </w:rPr>
         <w:t xml:space="preserve"> </w:t>
       </w:r>
-      <w:proofErr w:type="spellStart"/>
       <w:r>
         <w:rPr>
           <w:sz w:val="18"/>
         </w:rPr>
         <w:t>hackaton</w:t>
       </w:r>
-      <w:proofErr w:type="spellEnd"/>
       <w:r>
         <w:rPr>
           <w:spacing w:val="-2"/>
@@ -4766,7 +4697,7 @@
           </mc:Choice>
           <mc:Fallback>
             <w:pict>
-              <v:shape w14:anchorId="29E23D9F" id="Graphic 10" o:spid="_x0000_s1026" style="position:absolute;margin-left:34.55pt;margin-top:16.7pt;width:526.3pt;height:.75pt;z-index:-15726080;visibility:visible;mso-wrap-style:square;mso-wrap-distance-left:0;mso-wrap-distance-top:0;mso-wrap-distance-right:0;mso-wrap-distance-bottom:0;mso-position-horizontal:absolute;mso-position-horizontal-relative:page;mso-position-vertical:absolute;mso-position-vertical-relative:text;v-text-anchor:top" coordsize="6684009,9525" o:gfxdata="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" path="m6684009,l,,,9143r6684009,l6684009,xe" fillcolor="black" stroked="f">
+              <v:shape w14:anchorId="2EFCED57" id="Graphic 10" o:spid="_x0000_s1026" style="position:absolute;margin-left:34.55pt;margin-top:16.7pt;width:526.3pt;height:.75pt;z-index:-15726080;visibility:visible;mso-wrap-style:square;mso-wrap-distance-left:0;mso-wrap-distance-top:0;mso-wrap-distance-right:0;mso-wrap-distance-bottom:0;mso-position-horizontal:absolute;mso-position-horizontal-relative:page;mso-position-vertical:absolute;mso-position-vertical-relative:text;v-text-anchor:top" coordsize="6684009,9525" o:gfxdata="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" path="m6684009,l,,,9143r6684009,l6684009,xe" fillcolor="black" stroked="f">
                 <v:path arrowok="t"/>
                 <w10:wrap type="topAndBottom" anchorx="page"/>
               </v:shape>

</xml_diff>